<commit_message>
chore: finalize project repository
</commit_message>
<xml_diff>
--- a/Rapport Technique/Rapport_Technique_POC_Triage_CHSA.docx
+++ b/Rapport Technique/Rapport_Technique_POC_Triage_CHSA.docx
@@ -791,12 +791,6 @@
         <w:gridCol w:w="1400"/>
       </w:tblGrid>
       <w:tr>
-        <w:tblPrEx>
-          <w:tblCellMar>
-            <w:top w:w="0" w:type="dxa"/>
-            <w:bottom w:w="0" w:type="dxa"/>
-          </w:tblCellMar>
-        </w:tblPrEx>
         <w:trPr>
           <w:tblHeader/>
         </w:trPr>
@@ -910,12 +904,6 @@
         </w:tc>
       </w:tr>
       <w:tr>
-        <w:tblPrEx>
-          <w:tblCellMar>
-            <w:top w:w="0" w:type="dxa"/>
-            <w:bottom w:w="0" w:type="dxa"/>
-          </w:tblCellMar>
-        </w:tblPrEx>
         <w:tc>
           <w:tcPr>
             <w:tcW w:w="3400" w:type="dxa"/>
@@ -1039,12 +1027,6 @@
         </w:tc>
       </w:tr>
       <w:tr>
-        <w:tblPrEx>
-          <w:tblCellMar>
-            <w:top w:w="0" w:type="dxa"/>
-            <w:bottom w:w="0" w:type="dxa"/>
-          </w:tblCellMar>
-        </w:tblPrEx>
         <w:tc>
           <w:tcPr>
             <w:tcW w:w="3400" w:type="dxa"/>
@@ -1146,12 +1128,6 @@
         </w:tc>
       </w:tr>
       <w:tr>
-        <w:tblPrEx>
-          <w:tblCellMar>
-            <w:top w:w="0" w:type="dxa"/>
-            <w:bottom w:w="0" w:type="dxa"/>
-          </w:tblCellMar>
-        </w:tblPrEx>
         <w:tc>
           <w:tcPr>
             <w:tcW w:w="3400" w:type="dxa"/>
@@ -1249,12 +1225,6 @@
         </w:tc>
       </w:tr>
       <w:tr>
-        <w:tblPrEx>
-          <w:tblCellMar>
-            <w:top w:w="0" w:type="dxa"/>
-            <w:bottom w:w="0" w:type="dxa"/>
-          </w:tblCellMar>
-        </w:tblPrEx>
         <w:tc>
           <w:tcPr>
             <w:tcW w:w="3400" w:type="dxa"/>
@@ -1617,12 +1587,6 @@
         <w:gridCol w:w="3000"/>
       </w:tblGrid>
       <w:tr>
-        <w:tblPrEx>
-          <w:tblCellMar>
-            <w:top w:w="0" w:type="dxa"/>
-            <w:bottom w:w="0" w:type="dxa"/>
-          </w:tblCellMar>
-        </w:tblPrEx>
         <w:trPr>
           <w:tblHeader/>
         </w:trPr>
@@ -1709,12 +1673,6 @@
         </w:tc>
       </w:tr>
       <w:tr>
-        <w:tblPrEx>
-          <w:tblCellMar>
-            <w:top w:w="0" w:type="dxa"/>
-            <w:bottom w:w="0" w:type="dxa"/>
-          </w:tblCellMar>
-        </w:tblPrEx>
         <w:tc>
           <w:tcPr>
             <w:tcW w:w="4000" w:type="dxa"/>
@@ -1786,12 +1744,6 @@
         </w:tc>
       </w:tr>
       <w:tr>
-        <w:tblPrEx>
-          <w:tblCellMar>
-            <w:top w:w="0" w:type="dxa"/>
-            <w:bottom w:w="0" w:type="dxa"/>
-          </w:tblCellMar>
-        </w:tblPrEx>
         <w:tc>
           <w:tcPr>
             <w:tcW w:w="4000" w:type="dxa"/>
@@ -1866,12 +1818,6 @@
         </w:tc>
       </w:tr>
       <w:tr>
-        <w:tblPrEx>
-          <w:tblCellMar>
-            <w:top w:w="0" w:type="dxa"/>
-            <w:bottom w:w="0" w:type="dxa"/>
-          </w:tblCellMar>
-        </w:tblPrEx>
         <w:tc>
           <w:tcPr>
             <w:tcW w:w="4000" w:type="dxa"/>
@@ -1943,12 +1889,6 @@
         </w:tc>
       </w:tr>
       <w:tr>
-        <w:tblPrEx>
-          <w:tblCellMar>
-            <w:top w:w="0" w:type="dxa"/>
-            <w:bottom w:w="0" w:type="dxa"/>
-          </w:tblCellMar>
-        </w:tblPrEx>
         <w:tc>
           <w:tcPr>
             <w:tcW w:w="4000" w:type="dxa"/>
@@ -2905,12 +2845,6 @@
         <w:gridCol w:w="4300"/>
       </w:tblGrid>
       <w:tr>
-        <w:tblPrEx>
-          <w:tblCellMar>
-            <w:top w:w="0" w:type="dxa"/>
-            <w:bottom w:w="0" w:type="dxa"/>
-          </w:tblCellMar>
-        </w:tblPrEx>
         <w:trPr>
           <w:tblHeader/>
         </w:trPr>
@@ -2970,12 +2904,6 @@
         </w:tc>
       </w:tr>
       <w:tr>
-        <w:tblPrEx>
-          <w:tblCellMar>
-            <w:top w:w="0" w:type="dxa"/>
-            <w:bottom w:w="0" w:type="dxa"/>
-          </w:tblCellMar>
-        </w:tblPrEx>
         <w:tc>
           <w:tcPr>
             <w:tcW w:w="5500" w:type="dxa"/>
@@ -3041,12 +2969,6 @@
         </w:tc>
       </w:tr>
       <w:tr>
-        <w:tblPrEx>
-          <w:tblCellMar>
-            <w:top w:w="0" w:type="dxa"/>
-            <w:bottom w:w="0" w:type="dxa"/>
-          </w:tblCellMar>
-        </w:tblPrEx>
         <w:tc>
           <w:tcPr>
             <w:tcW w:w="5500" w:type="dxa"/>
@@ -3134,12 +3056,6 @@
         </w:tc>
       </w:tr>
       <w:tr>
-        <w:tblPrEx>
-          <w:tblCellMar>
-            <w:top w:w="0" w:type="dxa"/>
-            <w:bottom w:w="0" w:type="dxa"/>
-          </w:tblCellMar>
-        </w:tblPrEx>
         <w:tc>
           <w:tcPr>
             <w:tcW w:w="5500" w:type="dxa"/>
@@ -3197,12 +3113,6 @@
         </w:tc>
       </w:tr>
       <w:tr>
-        <w:tblPrEx>
-          <w:tblCellMar>
-            <w:top w:w="0" w:type="dxa"/>
-            <w:bottom w:w="0" w:type="dxa"/>
-          </w:tblCellMar>
-        </w:tblPrEx>
         <w:tc>
           <w:tcPr>
             <w:tcW w:w="5500" w:type="dxa"/>
@@ -3388,12 +3298,6 @@
         <w:gridCol w:w="4300"/>
       </w:tblGrid>
       <w:tr>
-        <w:tblPrEx>
-          <w:tblCellMar>
-            <w:top w:w="0" w:type="dxa"/>
-            <w:bottom w:w="0" w:type="dxa"/>
-          </w:tblCellMar>
-        </w:tblPrEx>
         <w:trPr>
           <w:tblHeader/>
         </w:trPr>
@@ -3476,12 +3380,6 @@
         </w:tc>
       </w:tr>
       <w:tr>
-        <w:tblPrEx>
-          <w:tblCellMar>
-            <w:top w:w="0" w:type="dxa"/>
-            <w:bottom w:w="0" w:type="dxa"/>
-          </w:tblCellMar>
-        </w:tblPrEx>
         <w:tc>
           <w:tcPr>
             <w:tcW w:w="5500" w:type="dxa"/>
@@ -3539,12 +3437,6 @@
         </w:tc>
       </w:tr>
       <w:tr>
-        <w:tblPrEx>
-          <w:tblCellMar>
-            <w:top w:w="0" w:type="dxa"/>
-            <w:bottom w:w="0" w:type="dxa"/>
-          </w:tblCellMar>
-        </w:tblPrEx>
         <w:tc>
           <w:tcPr>
             <w:tcW w:w="5500" w:type="dxa"/>
@@ -3604,12 +3496,6 @@
         </w:tc>
       </w:tr>
       <w:tr>
-        <w:tblPrEx>
-          <w:tblCellMar>
-            <w:top w:w="0" w:type="dxa"/>
-            <w:bottom w:w="0" w:type="dxa"/>
-          </w:tblCellMar>
-        </w:tblPrEx>
         <w:tc>
           <w:tcPr>
             <w:tcW w:w="5500" w:type="dxa"/>
@@ -3677,12 +3563,6 @@
         </w:tc>
       </w:tr>
       <w:tr>
-        <w:tblPrEx>
-          <w:tblCellMar>
-            <w:top w:w="0" w:type="dxa"/>
-            <w:bottom w:w="0" w:type="dxa"/>
-          </w:tblCellMar>
-        </w:tblPrEx>
         <w:tc>
           <w:tcPr>
             <w:tcW w:w="5500" w:type="dxa"/>
@@ -4229,59 +4109,634 @@
     <w:p>
       <w:pPr>
         <w:pStyle w:val="Titre2"/>
-        <w:spacing w:before="300" w:after="150"/>
-      </w:pPr>
-      <w:r>
-        <w:rPr>
-          <w:b/>
-          <w:bCs/>
-        </w:rPr>
-        <w:t>4.3 Pipeline CI/CD</w:t>
+      </w:pPr>
+      <w:r>
+        <w:rPr>
+          <w:rStyle w:val="lev"/>
+          <w:b w:val="0"/>
+          <w:bCs w:val="0"/>
+        </w:rPr>
+        <w:t>4.</w:t>
+      </w:r>
+      <w:r>
+        <w:rPr>
+          <w:rStyle w:val="lev"/>
+          <w:b w:val="0"/>
+          <w:bCs w:val="0"/>
+        </w:rPr>
+        <w:t>3</w:t>
+      </w:r>
+      <w:r>
+        <w:rPr>
+          <w:rStyle w:val="lev"/>
+          <w:b w:val="0"/>
+          <w:bCs w:val="0"/>
+        </w:rPr>
+        <w:t xml:space="preserve"> Pipeline CI/CD</w:t>
+      </w:r>
+    </w:p>
+    <w:p>
+      <w:pPr>
+        <w:pStyle w:val="NormalWeb"/>
+      </w:pPr>
+      <w:r>
+        <w:t xml:space="preserve">Un pipeline </w:t>
+      </w:r>
+      <w:r>
+        <w:rPr>
+          <w:rStyle w:val="lev"/>
+        </w:rPr>
+        <w:t>GitHub Actions</w:t>
+      </w:r>
+      <w:r>
+        <w:t xml:space="preserve"> a été mis en place et déclenché automatiquement à chaque push sur la branche principale.</w:t>
+      </w:r>
+    </w:p>
+    <w:p>
+      <w:pPr>
+        <w:pStyle w:val="NormalWeb"/>
+      </w:pPr>
+      <w:r>
+        <w:t xml:space="preserve">Le pipeline automatise l'ensemble du processus de déploiement : il construit l'image Docker, prépare les services nécessaires, lance l'environnement applicatif, vérifie la disponibilité de l'API via </w:t>
+      </w:r>
+      <w:proofErr w:type="spellStart"/>
+      <w:r>
+        <w:t>l'endpoint</w:t>
+      </w:r>
+      <w:proofErr w:type="spellEnd"/>
+      <w:r>
+        <w:t xml:space="preserve"> </w:t>
+      </w:r>
+      <w:r>
+        <w:rPr>
+          <w:rStyle w:val="CodeHTML"/>
+        </w:rPr>
+        <w:t>/</w:t>
+      </w:r>
+      <w:proofErr w:type="spellStart"/>
+      <w:r>
+        <w:rPr>
+          <w:rStyle w:val="CodeHTML"/>
+        </w:rPr>
+        <w:t>health</w:t>
+      </w:r>
+      <w:proofErr w:type="spellEnd"/>
+      <w:r>
+        <w:t>, contrôle le bon fonctionnement des composants et nettoie l'environnement après exécution.</w:t>
+      </w:r>
+    </w:p>
+    <w:p>
+      <w:pPr>
+        <w:pStyle w:val="NormalWeb"/>
+      </w:pPr>
+      <w:r>
+        <w:t xml:space="preserve">L'intégration de </w:t>
+      </w:r>
+      <w:r>
+        <w:rPr>
+          <w:rStyle w:val="lev"/>
+        </w:rPr>
+        <w:t>Docker Compose</w:t>
+      </w:r>
+      <w:r>
+        <w:t xml:space="preserve"> permet d'orchestrer les services </w:t>
+      </w:r>
+      <w:proofErr w:type="spellStart"/>
+      <w:r>
+        <w:rPr>
+          <w:rStyle w:val="lev"/>
+        </w:rPr>
+        <w:t>FastAPI</w:t>
+      </w:r>
+      <w:proofErr w:type="spellEnd"/>
+      <w:r>
+        <w:rPr>
+          <w:rStyle w:val="lev"/>
+        </w:rPr>
+        <w:t xml:space="preserve"> et </w:t>
+      </w:r>
+      <w:proofErr w:type="spellStart"/>
+      <w:r>
+        <w:rPr>
+          <w:rStyle w:val="lev"/>
+        </w:rPr>
+        <w:t>vLLM</w:t>
+      </w:r>
+      <w:proofErr w:type="spellEnd"/>
+      <w:r>
+        <w:t>, tandis que les variables d'environnement nécessaires (</w:t>
+      </w:r>
+      <w:r>
+        <w:rPr>
+          <w:rStyle w:val="CodeHTML"/>
+        </w:rPr>
+        <w:t>MODEL_NAME</w:t>
+      </w:r>
+      <w:r>
+        <w:t xml:space="preserve">, </w:t>
+      </w:r>
+      <w:r>
+        <w:rPr>
+          <w:rStyle w:val="CodeHTML"/>
+        </w:rPr>
+        <w:t>HF_TOKEN</w:t>
+      </w:r>
+      <w:r>
+        <w:t xml:space="preserve">, </w:t>
+      </w:r>
+      <w:r>
+        <w:rPr>
+          <w:rStyle w:val="CodeHTML"/>
+        </w:rPr>
+        <w:t>TRIAGE_API_KEY</w:t>
+      </w:r>
+      <w:r>
+        <w:t>) sont injectées lors du déploiement sans être exposées dans le code source.</w:t>
+      </w:r>
+    </w:p>
+    <w:p>
+      <w:pPr>
+        <w:pStyle w:val="NormalWeb"/>
+      </w:pPr>
+      <w:r>
+        <w:lastRenderedPageBreak/>
+        <w:t xml:space="preserve">Ainsi, le pipeline CI/CD garantit un </w:t>
+      </w:r>
+      <w:r>
+        <w:rPr>
+          <w:rStyle w:val="lev"/>
+        </w:rPr>
+        <w:t>déploiement reproductible, automatisé et complet de l'architecture</w:t>
+      </w:r>
+      <w:r>
+        <w:t>, depuis la construction de l'image jusqu'à la vérification du service déployé. Chaque modification intégrée sur la branche principale passe par ce processus, ce qui réduit les risques de régression et assure la cohérence de l'environnement de déploiement.</w:t>
+      </w:r>
+    </w:p>
+    <w:p>
+      <w:pPr>
+        <w:pStyle w:val="Titre3"/>
+      </w:pPr>
+      <w:r>
+        <w:t>État final de l'infrastructure</w:t>
+      </w:r>
+    </w:p>
+    <w:p>
+      <w:pPr>
+        <w:numPr>
+          <w:ilvl w:val="0"/>
+          <w:numId w:val="5"/>
+        </w:numPr>
+        <w:spacing w:before="100" w:beforeAutospacing="1" w:after="100" w:afterAutospacing="1"/>
+      </w:pPr>
+      <w:r>
+        <w:rPr>
+          <w:rFonts w:ascii="Apple Color Emoji" w:hAnsi="Apple Color Emoji" w:cs="Apple Color Emoji"/>
+        </w:rPr>
+        <w:t>✅</w:t>
+      </w:r>
+      <w:r>
+        <w:t xml:space="preserve"> Authentification </w:t>
+      </w:r>
+      <w:r>
+        <w:rPr>
+          <w:rStyle w:val="CodeHTML"/>
+        </w:rPr>
+        <w:t>X-API-Key</w:t>
+      </w:r>
+      <w:r>
+        <w:t xml:space="preserve"> </w:t>
+      </w:r>
+    </w:p>
+    <w:p>
+      <w:pPr>
+        <w:numPr>
+          <w:ilvl w:val="0"/>
+          <w:numId w:val="5"/>
+        </w:numPr>
+        <w:spacing w:before="100" w:beforeAutospacing="1" w:after="100" w:afterAutospacing="1"/>
+      </w:pPr>
+      <w:r>
+        <w:rPr>
+          <w:rFonts w:ascii="Apple Color Emoji" w:hAnsi="Apple Color Emoji" w:cs="Apple Color Emoji"/>
+        </w:rPr>
+        <w:t>✅</w:t>
+      </w:r>
+      <w:r>
+        <w:t xml:space="preserve"> Gestion des secrets </w:t>
+      </w:r>
+      <w:proofErr w:type="gramStart"/>
+      <w:r>
+        <w:t xml:space="preserve">via </w:t>
+      </w:r>
+      <w:r>
+        <w:rPr>
+          <w:rStyle w:val="CodeHTML"/>
+        </w:rPr>
+        <w:t>.</w:t>
+      </w:r>
+      <w:proofErr w:type="spellStart"/>
+      <w:r>
+        <w:rPr>
+          <w:rStyle w:val="CodeHTML"/>
+        </w:rPr>
+        <w:t>env</w:t>
+      </w:r>
+      <w:proofErr w:type="spellEnd"/>
+      <w:proofErr w:type="gramEnd"/>
+      <w:r>
+        <w:t xml:space="preserve"> </w:t>
+      </w:r>
+    </w:p>
+    <w:p>
+      <w:pPr>
+        <w:numPr>
+          <w:ilvl w:val="0"/>
+          <w:numId w:val="5"/>
+        </w:numPr>
+        <w:spacing w:before="100" w:beforeAutospacing="1" w:after="100" w:afterAutospacing="1"/>
+      </w:pPr>
+      <w:proofErr w:type="gramStart"/>
+      <w:r>
+        <w:rPr>
+          <w:rFonts w:ascii="Apple Color Emoji" w:hAnsi="Apple Color Emoji" w:cs="Apple Color Emoji"/>
+        </w:rPr>
+        <w:t>✅</w:t>
+      </w:r>
+      <w:r>
+        <w:t xml:space="preserve"> </w:t>
+      </w:r>
+      <w:r>
+        <w:rPr>
+          <w:rStyle w:val="CodeHTML"/>
+        </w:rPr>
+        <w:t>.</w:t>
+      </w:r>
+      <w:proofErr w:type="spellStart"/>
+      <w:r>
+        <w:rPr>
+          <w:rStyle w:val="CodeHTML"/>
+        </w:rPr>
+        <w:t>env</w:t>
+      </w:r>
+      <w:proofErr w:type="spellEnd"/>
+      <w:proofErr w:type="gramEnd"/>
+      <w:r>
+        <w:t xml:space="preserve"> exclu du dépôt Git </w:t>
+      </w:r>
+    </w:p>
+    <w:p>
+      <w:pPr>
+        <w:numPr>
+          <w:ilvl w:val="0"/>
+          <w:numId w:val="5"/>
+        </w:numPr>
+        <w:spacing w:before="100" w:beforeAutospacing="1" w:after="100" w:afterAutospacing="1"/>
+      </w:pPr>
+      <w:r>
+        <w:rPr>
+          <w:rFonts w:ascii="Apple Color Emoji" w:hAnsi="Apple Color Emoji" w:cs="Apple Color Emoji"/>
+        </w:rPr>
+        <w:t>✅</w:t>
+      </w:r>
+      <w:r>
+        <w:t xml:space="preserve"> Logs structurés sans conservation inutile de données médicales </w:t>
+      </w:r>
+    </w:p>
+    <w:p>
+      <w:pPr>
+        <w:numPr>
+          <w:ilvl w:val="0"/>
+          <w:numId w:val="5"/>
+        </w:numPr>
+        <w:spacing w:before="100" w:beforeAutospacing="1" w:after="100" w:afterAutospacing="1"/>
+      </w:pPr>
+      <w:r>
+        <w:rPr>
+          <w:rFonts w:ascii="Apple Color Emoji" w:hAnsi="Apple Color Emoji" w:cs="Apple Color Emoji"/>
+        </w:rPr>
+        <w:t>✅</w:t>
+      </w:r>
+      <w:r>
+        <w:t xml:space="preserve"> </w:t>
+      </w:r>
+      <w:r>
+        <w:rPr>
+          <w:rStyle w:val="CodeHTML"/>
+        </w:rPr>
+        <w:t>requirements.txt</w:t>
+      </w:r>
+      <w:r>
+        <w:t xml:space="preserve"> versionné </w:t>
+      </w:r>
+    </w:p>
+    <w:p>
+      <w:pPr>
+        <w:numPr>
+          <w:ilvl w:val="0"/>
+          <w:numId w:val="5"/>
+        </w:numPr>
+        <w:spacing w:before="100" w:beforeAutospacing="1" w:after="100" w:afterAutospacing="1"/>
+      </w:pPr>
+      <w:r>
+        <w:rPr>
+          <w:rFonts w:ascii="Apple Color Emoji" w:hAnsi="Apple Color Emoji" w:cs="Apple Color Emoji"/>
+        </w:rPr>
+        <w:t>✅</w:t>
+      </w:r>
+      <w:r>
+        <w:t xml:space="preserve"> </w:t>
+      </w:r>
+      <w:r>
+        <w:rPr>
+          <w:rStyle w:val="CodeHTML"/>
+        </w:rPr>
+        <w:t>requirements-training.txt</w:t>
+      </w:r>
+      <w:r>
+        <w:t xml:space="preserve"> séparé </w:t>
+      </w:r>
+    </w:p>
+    <w:p>
+      <w:pPr>
+        <w:numPr>
+          <w:ilvl w:val="0"/>
+          <w:numId w:val="5"/>
+        </w:numPr>
+        <w:spacing w:before="100" w:beforeAutospacing="1" w:after="100" w:afterAutospacing="1"/>
+      </w:pPr>
+      <w:r>
+        <w:rPr>
+          <w:rFonts w:ascii="Apple Color Emoji" w:hAnsi="Apple Color Emoji" w:cs="Apple Color Emoji"/>
+        </w:rPr>
+        <w:t>✅</w:t>
+      </w:r>
+      <w:r>
+        <w:t xml:space="preserve"> </w:t>
+      </w:r>
+      <w:proofErr w:type="spellStart"/>
+      <w:r>
+        <w:t>Dockerfile</w:t>
+      </w:r>
+      <w:proofErr w:type="spellEnd"/>
+      <w:r>
+        <w:t xml:space="preserve"> </w:t>
+      </w:r>
+    </w:p>
+    <w:p>
+      <w:pPr>
+        <w:numPr>
+          <w:ilvl w:val="0"/>
+          <w:numId w:val="5"/>
+        </w:numPr>
+        <w:spacing w:before="100" w:beforeAutospacing="1" w:after="100" w:afterAutospacing="1"/>
+      </w:pPr>
+      <w:r>
+        <w:rPr>
+          <w:rFonts w:ascii="Apple Color Emoji" w:hAnsi="Apple Color Emoji" w:cs="Apple Color Emoji"/>
+        </w:rPr>
+        <w:t>✅</w:t>
+      </w:r>
+      <w:r>
+        <w:t xml:space="preserve"> Docker Compose </w:t>
+      </w:r>
+      <w:proofErr w:type="spellStart"/>
+      <w:r>
+        <w:rPr>
+          <w:rStyle w:val="lev"/>
+        </w:rPr>
+        <w:t>FastAPI</w:t>
+      </w:r>
+      <w:proofErr w:type="spellEnd"/>
+      <w:r>
+        <w:rPr>
+          <w:rStyle w:val="lev"/>
+        </w:rPr>
+        <w:t xml:space="preserve"> + </w:t>
+      </w:r>
+      <w:proofErr w:type="spellStart"/>
+      <w:r>
+        <w:rPr>
+          <w:rStyle w:val="lev"/>
+        </w:rPr>
+        <w:t>vLLM</w:t>
+      </w:r>
+      <w:proofErr w:type="spellEnd"/>
+      <w:r>
+        <w:t xml:space="preserve"> </w:t>
+      </w:r>
+    </w:p>
+    <w:p>
+      <w:pPr>
+        <w:numPr>
+          <w:ilvl w:val="0"/>
+          <w:numId w:val="5"/>
+        </w:numPr>
+        <w:spacing w:before="100" w:beforeAutospacing="1" w:after="100" w:afterAutospacing="1"/>
+        <w:rPr>
+          <w:lang w:val="en-US"/>
+        </w:rPr>
+      </w:pPr>
+      <w:r>
+        <w:rPr>
+          <w:rFonts w:ascii="Apple Color Emoji" w:hAnsi="Apple Color Emoji" w:cs="Apple Color Emoji"/>
+          <w:lang w:val="en-US"/>
+        </w:rPr>
+        <w:t>✅</w:t>
+      </w:r>
+      <w:r>
+        <w:rPr>
+          <w:lang w:val="en-US"/>
+        </w:rPr>
+        <w:t xml:space="preserve"> Variables </w:t>
+      </w:r>
+      <w:r>
+        <w:rPr>
+          <w:rStyle w:val="CodeHTML"/>
+          <w:lang w:val="en-US"/>
+        </w:rPr>
+        <w:t>MODEL_NAME</w:t>
+      </w:r>
+      <w:r>
+        <w:rPr>
+          <w:lang w:val="en-US"/>
+        </w:rPr>
+        <w:t xml:space="preserve"> / </w:t>
+      </w:r>
+      <w:r>
+        <w:rPr>
+          <w:rStyle w:val="CodeHTML"/>
+          <w:lang w:val="en-US"/>
+        </w:rPr>
+        <w:t>HF_TOKEN</w:t>
+      </w:r>
+      <w:r>
+        <w:rPr>
+          <w:lang w:val="en-US"/>
+        </w:rPr>
+        <w:t xml:space="preserve"> / </w:t>
+      </w:r>
+      <w:r>
+        <w:rPr>
+          <w:rStyle w:val="CodeHTML"/>
+          <w:lang w:val="en-US"/>
+        </w:rPr>
+        <w:t>TRIAGE_API_KEY</w:t>
+      </w:r>
+      <w:r>
+        <w:rPr>
+          <w:lang w:val="en-US"/>
+        </w:rPr>
+        <w:t xml:space="preserve"> </w:t>
+      </w:r>
+    </w:p>
+    <w:p>
+      <w:pPr>
+        <w:numPr>
+          <w:ilvl w:val="0"/>
+          <w:numId w:val="5"/>
+        </w:numPr>
+        <w:spacing w:before="100" w:beforeAutospacing="1" w:after="100" w:afterAutospacing="1"/>
+      </w:pPr>
+      <w:r>
+        <w:rPr>
+          <w:rFonts w:ascii="Apple Color Emoji" w:hAnsi="Apple Color Emoji" w:cs="Apple Color Emoji"/>
+        </w:rPr>
+        <w:t>✅</w:t>
+      </w:r>
+      <w:r>
+        <w:t xml:space="preserve"> Pipeline GitHub Actions </w:t>
+      </w:r>
+    </w:p>
+    <w:p>
+      <w:pPr>
+        <w:numPr>
+          <w:ilvl w:val="0"/>
+          <w:numId w:val="5"/>
+        </w:numPr>
+        <w:spacing w:before="100" w:beforeAutospacing="1" w:after="100" w:afterAutospacing="1"/>
+      </w:pPr>
+      <w:r>
+        <w:rPr>
+          <w:rFonts w:ascii="Apple Color Emoji" w:hAnsi="Apple Color Emoji" w:cs="Apple Color Emoji"/>
+        </w:rPr>
+        <w:t>✅</w:t>
+      </w:r>
+      <w:r>
+        <w:t xml:space="preserve"> Construction automatisée de l'image </w:t>
+      </w:r>
+    </w:p>
+    <w:p>
+      <w:pPr>
+        <w:numPr>
+          <w:ilvl w:val="0"/>
+          <w:numId w:val="5"/>
+        </w:numPr>
+        <w:spacing w:before="100" w:beforeAutospacing="1" w:after="100" w:afterAutospacing="1"/>
+      </w:pPr>
+      <w:r>
+        <w:rPr>
+          <w:rFonts w:ascii="Apple Color Emoji" w:hAnsi="Apple Color Emoji" w:cs="Apple Color Emoji"/>
+        </w:rPr>
+        <w:t>✅</w:t>
+      </w:r>
+      <w:r>
+        <w:t xml:space="preserve"> Déploiement automatisé </w:t>
+      </w:r>
+    </w:p>
+    <w:p>
+      <w:pPr>
+        <w:numPr>
+          <w:ilvl w:val="0"/>
+          <w:numId w:val="5"/>
+        </w:numPr>
+        <w:spacing w:before="100" w:beforeAutospacing="1" w:after="100" w:afterAutospacing="1"/>
+      </w:pPr>
+      <w:r>
+        <w:rPr>
+          <w:rFonts w:ascii="Apple Color Emoji" w:hAnsi="Apple Color Emoji" w:cs="Apple Color Emoji"/>
+        </w:rPr>
+        <w:t>✅</w:t>
+      </w:r>
+      <w:r>
+        <w:t xml:space="preserve"> </w:t>
+      </w:r>
+      <w:proofErr w:type="spellStart"/>
+      <w:r>
+        <w:t>Healthcheck</w:t>
+      </w:r>
+      <w:proofErr w:type="spellEnd"/>
+      <w:r>
+        <w:t xml:space="preserve"> </w:t>
+      </w:r>
+      <w:r>
+        <w:rPr>
+          <w:rStyle w:val="CodeHTML"/>
+        </w:rPr>
+        <w:t>/</w:t>
+      </w:r>
+      <w:proofErr w:type="spellStart"/>
+      <w:r>
+        <w:rPr>
+          <w:rStyle w:val="CodeHTML"/>
+        </w:rPr>
+        <w:t>health</w:t>
+      </w:r>
+      <w:proofErr w:type="spellEnd"/>
+      <w:r>
+        <w:t xml:space="preserve"> </w:t>
+      </w:r>
+    </w:p>
+    <w:p>
+      <w:pPr>
+        <w:numPr>
+          <w:ilvl w:val="0"/>
+          <w:numId w:val="5"/>
+        </w:numPr>
+        <w:spacing w:before="100" w:beforeAutospacing="1" w:after="100" w:afterAutospacing="1"/>
+      </w:pPr>
+      <w:r>
+        <w:rPr>
+          <w:rFonts w:ascii="Apple Color Emoji" w:hAnsi="Apple Color Emoji" w:cs="Apple Color Emoji"/>
+        </w:rPr>
+        <w:t>✅</w:t>
+      </w:r>
+      <w:r>
+        <w:t xml:space="preserve"> Vérification du service après déploiement </w:t>
+      </w:r>
+    </w:p>
+    <w:p>
+      <w:pPr>
+        <w:numPr>
+          <w:ilvl w:val="0"/>
+          <w:numId w:val="5"/>
+        </w:numPr>
+        <w:spacing w:before="100" w:beforeAutospacing="1" w:after="100" w:afterAutospacing="1"/>
+      </w:pPr>
+      <w:r>
+        <w:rPr>
+          <w:rFonts w:ascii="Apple Color Emoji" w:hAnsi="Apple Color Emoji" w:cs="Apple Color Emoji"/>
+        </w:rPr>
+        <w:t>✅</w:t>
+      </w:r>
+      <w:r>
+        <w:t xml:space="preserve"> Nettoyage automatique de l'environnement </w:t>
+      </w:r>
+    </w:p>
+    <w:p>
+      <w:pPr>
+        <w:pStyle w:val="NormalWeb"/>
+      </w:pPr>
+      <w:r>
+        <w:rPr>
+          <w:rStyle w:val="lev"/>
+        </w:rPr>
+        <w:t>La chaîne de déploiement est ainsi considérée comme finalisée pour le POC.</w:t>
       </w:r>
     </w:p>
     <w:p>
       <w:pPr>
         <w:spacing w:after="160" w:line="300" w:lineRule="auto"/>
       </w:pPr>
-      <w:r>
-        <w:rPr>
-          <w:sz w:val="21"/>
-          <w:szCs w:val="21"/>
-        </w:rPr>
-        <w:t xml:space="preserve">Un pipeline GitHub Actions a été mis en place, déclenché à chaque push sur la branche principale. Il construit automatiquement l'image Docker, lance le conteneur, vérifie que </w:t>
-      </w:r>
-      <w:proofErr w:type="spellStart"/>
-      <w:r>
-        <w:rPr>
-          <w:sz w:val="21"/>
-          <w:szCs w:val="21"/>
-        </w:rPr>
-        <w:t>l'endpoint</w:t>
-      </w:r>
-      <w:proofErr w:type="spellEnd"/>
-      <w:r>
-        <w:rPr>
-          <w:sz w:val="21"/>
-          <w:szCs w:val="21"/>
-        </w:rPr>
-        <w:t xml:space="preserve"> /</w:t>
-      </w:r>
-      <w:proofErr w:type="spellStart"/>
-      <w:r>
-        <w:rPr>
-          <w:sz w:val="21"/>
-          <w:szCs w:val="21"/>
-        </w:rPr>
-        <w:t>health</w:t>
-      </w:r>
-      <w:proofErr w:type="spellEnd"/>
-      <w:r>
-        <w:rPr>
-          <w:sz w:val="21"/>
-          <w:szCs w:val="21"/>
-        </w:rPr>
-        <w:t xml:space="preserve"> répond, puis nettoie l'environnement — garantissant un processus de déploiement reproductible et testé à chaque évolution du code.</w:t>
-      </w:r>
     </w:p>
     <w:p>
       <w:pPr>
@@ -4360,12 +4815,6 @@
         <w:gridCol w:w="4300"/>
       </w:tblGrid>
       <w:tr>
-        <w:tblPrEx>
-          <w:tblCellMar>
-            <w:top w:w="0" w:type="dxa"/>
-            <w:bottom w:w="0" w:type="dxa"/>
-          </w:tblCellMar>
-        </w:tblPrEx>
         <w:trPr>
           <w:tblHeader/>
         </w:trPr>
@@ -4392,7 +4841,6 @@
                 <w:sz w:val="19"/>
                 <w:szCs w:val="19"/>
               </w:rPr>
-              <w:lastRenderedPageBreak/>
               <w:t>Métrique</w:t>
             </w:r>
           </w:p>
@@ -4426,12 +4874,6 @@
         </w:tc>
       </w:tr>
       <w:tr>
-        <w:tblPrEx>
-          <w:tblCellMar>
-            <w:top w:w="0" w:type="dxa"/>
-            <w:bottom w:w="0" w:type="dxa"/>
-          </w:tblCellMar>
-        </w:tblPrEx>
         <w:tc>
           <w:tcPr>
             <w:tcW w:w="5500" w:type="dxa"/>
@@ -4479,12 +4921,6 @@
         </w:tc>
       </w:tr>
       <w:tr>
-        <w:tblPrEx>
-          <w:tblCellMar>
-            <w:top w:w="0" w:type="dxa"/>
-            <w:bottom w:w="0" w:type="dxa"/>
-          </w:tblCellMar>
-        </w:tblPrEx>
         <w:tc>
           <w:tcPr>
             <w:tcW w:w="5500" w:type="dxa"/>
@@ -4534,12 +4970,6 @@
         </w:tc>
       </w:tr>
       <w:tr>
-        <w:tblPrEx>
-          <w:tblCellMar>
-            <w:top w:w="0" w:type="dxa"/>
-            <w:bottom w:w="0" w:type="dxa"/>
-          </w:tblCellMar>
-        </w:tblPrEx>
         <w:tc>
           <w:tcPr>
             <w:tcW w:w="5500" w:type="dxa"/>
@@ -4587,12 +5017,6 @@
         </w:tc>
       </w:tr>
       <w:tr>
-        <w:tblPrEx>
-          <w:tblCellMar>
-            <w:top w:w="0" w:type="dxa"/>
-            <w:bottom w:w="0" w:type="dxa"/>
-          </w:tblCellMar>
-        </w:tblPrEx>
         <w:tc>
           <w:tcPr>
             <w:tcW w:w="5500" w:type="dxa"/>
@@ -4642,12 +5066,6 @@
         </w:tc>
       </w:tr>
       <w:tr>
-        <w:tblPrEx>
-          <w:tblCellMar>
-            <w:top w:w="0" w:type="dxa"/>
-            <w:bottom w:w="0" w:type="dxa"/>
-          </w:tblCellMar>
-        </w:tblPrEx>
         <w:tc>
           <w:tcPr>
             <w:tcW w:w="5500" w:type="dxa"/>
@@ -4695,12 +5113,6 @@
         </w:tc>
       </w:tr>
       <w:tr>
-        <w:tblPrEx>
-          <w:tblCellMar>
-            <w:top w:w="0" w:type="dxa"/>
-            <w:bottom w:w="0" w:type="dxa"/>
-          </w:tblCellMar>
-        </w:tblPrEx>
         <w:tc>
           <w:tcPr>
             <w:tcW w:w="5500" w:type="dxa"/>
@@ -4835,12 +5247,6 @@
         <w:gridCol w:w="4400"/>
       </w:tblGrid>
       <w:tr>
-        <w:tblPrEx>
-          <w:tblCellMar>
-            <w:top w:w="0" w:type="dxa"/>
-            <w:bottom w:w="0" w:type="dxa"/>
-          </w:tblCellMar>
-        </w:tblPrEx>
         <w:trPr>
           <w:tblHeader/>
         </w:trPr>
@@ -4867,6 +5273,7 @@
                 <w:sz w:val="19"/>
                 <w:szCs w:val="19"/>
               </w:rPr>
+              <w:lastRenderedPageBreak/>
               <w:t>Scénario testé</w:t>
             </w:r>
           </w:p>
@@ -4927,12 +5334,6 @@
         </w:tc>
       </w:tr>
       <w:tr>
-        <w:tblPrEx>
-          <w:tblCellMar>
-            <w:top w:w="0" w:type="dxa"/>
-            <w:bottom w:w="0" w:type="dxa"/>
-          </w:tblCellMar>
-        </w:tblPrEx>
         <w:tc>
           <w:tcPr>
             <w:tcW w:w="3600" w:type="dxa"/>
@@ -5022,12 +5423,6 @@
         </w:tc>
       </w:tr>
       <w:tr>
-        <w:tblPrEx>
-          <w:tblCellMar>
-            <w:top w:w="0" w:type="dxa"/>
-            <w:bottom w:w="0" w:type="dxa"/>
-          </w:tblCellMar>
-        </w:tblPrEx>
         <w:tc>
           <w:tcPr>
             <w:tcW w:w="3600" w:type="dxa"/>
@@ -5102,12 +5497,6 @@
         </w:tc>
       </w:tr>
       <w:tr>
-        <w:tblPrEx>
-          <w:tblCellMar>
-            <w:top w:w="0" w:type="dxa"/>
-            <w:bottom w:w="0" w:type="dxa"/>
-          </w:tblCellMar>
-        </w:tblPrEx>
         <w:tc>
           <w:tcPr>
             <w:tcW w:w="3600" w:type="dxa"/>
@@ -5374,7 +5763,6 @@
           <w:b/>
           <w:bCs/>
         </w:rPr>
-        <w:lastRenderedPageBreak/>
         <w:t>6.2 Hallucinations factuelles</w:t>
       </w:r>
     </w:p>
@@ -5433,7 +5821,23 @@
           <w:sz w:val="21"/>
           <w:szCs w:val="21"/>
         </w:rPr>
-        <w:t>Absence d'authentification sur l'API de démonstration ;</w:t>
+        <w:t xml:space="preserve">Gestion sans dégradation gracieuse des contextes patients dépassant la fenêtre de contexte du modèle (2048 </w:t>
+      </w:r>
+      <w:proofErr w:type="spellStart"/>
+      <w:r>
+        <w:rPr>
+          <w:sz w:val="21"/>
+          <w:szCs w:val="21"/>
+        </w:rPr>
+        <w:t>tokens</w:t>
+      </w:r>
+      <w:proofErr w:type="spellEnd"/>
+      <w:r>
+        <w:rPr>
+          <w:sz w:val="21"/>
+          <w:szCs w:val="21"/>
+        </w:rPr>
+        <w:t>) ;</w:t>
       </w:r>
     </w:p>
     <w:p>
@@ -5450,39 +5854,6 @@
           <w:sz w:val="21"/>
           <w:szCs w:val="21"/>
         </w:rPr>
-        <w:t xml:space="preserve">Gestion sans dégradation gracieuse des contextes patients dépassant la fenêtre de contexte du modèle (2048 </w:t>
-      </w:r>
-      <w:proofErr w:type="spellStart"/>
-      <w:r>
-        <w:rPr>
-          <w:sz w:val="21"/>
-          <w:szCs w:val="21"/>
-        </w:rPr>
-        <w:t>tokens</w:t>
-      </w:r>
-      <w:proofErr w:type="spellEnd"/>
-      <w:r>
-        <w:rPr>
-          <w:sz w:val="21"/>
-          <w:szCs w:val="21"/>
-        </w:rPr>
-        <w:t>) ;</w:t>
-      </w:r>
-    </w:p>
-    <w:p>
-      <w:pPr>
-        <w:pStyle w:val="Paragraphedeliste"/>
-        <w:numPr>
-          <w:ilvl w:val="0"/>
-          <w:numId w:val="2"/>
-        </w:numPr>
-        <w:spacing w:after="80" w:line="280" w:lineRule="auto"/>
-      </w:pPr>
-      <w:r>
-        <w:rPr>
-          <w:sz w:val="21"/>
-          <w:szCs w:val="21"/>
-        </w:rPr>
         <w:t>Anonymisation RGPD avec faux positifs résiduels sur du vocabulaire médical rare.</w:t>
       </w:r>
     </w:p>
@@ -5509,6 +5880,7 @@
           <w:sz w:val="21"/>
           <w:szCs w:val="21"/>
         </w:rPr>
+        <w:lastRenderedPageBreak/>
         <w:t>Cette checklist synthétise l'aptitude du système à un déploiement en conditions réelles, sur les plans technique et clinique.</w:t>
       </w:r>
     </w:p>
@@ -5548,12 +5920,6 @@
         <w:gridCol w:w="4800"/>
       </w:tblGrid>
       <w:tr>
-        <w:tblPrEx>
-          <w:tblCellMar>
-            <w:top w:w="0" w:type="dxa"/>
-            <w:bottom w:w="0" w:type="dxa"/>
-          </w:tblCellMar>
-        </w:tblPrEx>
         <w:trPr>
           <w:tblHeader/>
         </w:trPr>
@@ -5634,12 +6000,6 @@
         </w:tc>
       </w:tr>
       <w:tr>
-        <w:tblPrEx>
-          <w:tblCellMar>
-            <w:top w:w="0" w:type="dxa"/>
-            <w:bottom w:w="0" w:type="dxa"/>
-          </w:tblCellMar>
-        </w:tblPrEx>
         <w:tc>
           <w:tcPr>
             <w:tcW w:w="3000" w:type="dxa"/>
@@ -5711,12 +6071,6 @@
         </w:tc>
       </w:tr>
       <w:tr>
-        <w:tblPrEx>
-          <w:tblCellMar>
-            <w:top w:w="0" w:type="dxa"/>
-            <w:bottom w:w="0" w:type="dxa"/>
-          </w:tblCellMar>
-        </w:tblPrEx>
         <w:tc>
           <w:tcPr>
             <w:tcW w:w="3000" w:type="dxa"/>
@@ -5788,12 +6142,6 @@
         </w:tc>
       </w:tr>
       <w:tr>
-        <w:tblPrEx>
-          <w:tblCellMar>
-            <w:top w:w="0" w:type="dxa"/>
-            <w:bottom w:w="0" w:type="dxa"/>
-          </w:tblCellMar>
-        </w:tblPrEx>
         <w:tc>
           <w:tcPr>
             <w:tcW w:w="3000" w:type="dxa"/>
@@ -5895,12 +6243,6 @@
         </w:tc>
       </w:tr>
       <w:tr>
-        <w:tblPrEx>
-          <w:tblCellMar>
-            <w:top w:w="0" w:type="dxa"/>
-            <w:bottom w:w="0" w:type="dxa"/>
-          </w:tblCellMar>
-        </w:tblPrEx>
         <w:tc>
           <w:tcPr>
             <w:tcW w:w="3000" w:type="dxa"/>
@@ -5972,12 +6314,6 @@
         </w:tc>
       </w:tr>
       <w:tr>
-        <w:tblPrEx>
-          <w:tblCellMar>
-            <w:top w:w="0" w:type="dxa"/>
-            <w:bottom w:w="0" w:type="dxa"/>
-          </w:tblCellMar>
-        </w:tblPrEx>
         <w:tc>
           <w:tcPr>
             <w:tcW w:w="3000" w:type="dxa"/>
@@ -6049,12 +6385,6 @@
         </w:tc>
       </w:tr>
       <w:tr>
-        <w:tblPrEx>
-          <w:tblCellMar>
-            <w:top w:w="0" w:type="dxa"/>
-            <w:bottom w:w="0" w:type="dxa"/>
-          </w:tblCellMar>
-        </w:tblPrEx>
         <w:tc>
           <w:tcPr>
             <w:tcW w:w="3000" w:type="dxa"/>
@@ -6126,12 +6456,9 @@
         </w:tc>
       </w:tr>
       <w:tr>
-        <w:tblPrEx>
-          <w:tblCellMar>
-            <w:top w:w="0" w:type="dxa"/>
-            <w:bottom w:w="0" w:type="dxa"/>
-          </w:tblCellMar>
-        </w:tblPrEx>
+        <w:trPr>
+          <w:trHeight w:val="297"/>
+        </w:trPr>
         <w:tc>
           <w:tcPr>
             <w:tcW w:w="3000" w:type="dxa"/>
@@ -6143,6 +6470,13 @@
             </w:tcMar>
           </w:tcPr>
           <w:p>
+            <w:pPr>
+              <w:rPr>
+                <w:color w:val="000000"/>
+                <w:sz w:val="19"/>
+                <w:szCs w:val="19"/>
+              </w:rPr>
+            </w:pPr>
             <w:r>
               <w:rPr>
                 <w:color w:val="000000"/>
@@ -6151,6 +6485,15 @@
               </w:rPr>
               <w:t>Pipeline CI/CD</w:t>
             </w:r>
+          </w:p>
+          <w:p>
+            <w:pPr>
+              <w:rPr>
+                <w:color w:val="000000"/>
+                <w:sz w:val="19"/>
+                <w:szCs w:val="19"/>
+              </w:rPr>
+            </w:pPr>
           </w:p>
         </w:tc>
         <w:tc>
@@ -6164,6 +6507,150 @@
               <w:right w:w="120" w:type="dxa"/>
             </w:tcMar>
           </w:tcPr>
+          <w:p>
+            <w:pPr>
+              <w:jc w:val="center"/>
+              <w:rPr>
+                <w:b/>
+                <w:bCs/>
+                <w:color w:val="2E7D32"/>
+                <w:sz w:val="19"/>
+                <w:szCs w:val="19"/>
+              </w:rPr>
+            </w:pPr>
+            <w:r>
+              <w:rPr>
+                <w:b/>
+                <w:bCs/>
+                <w:color w:val="2E7D32"/>
+                <w:sz w:val="19"/>
+                <w:szCs w:val="19"/>
+              </w:rPr>
+              <w:t>GO</w:t>
+            </w:r>
+          </w:p>
+          <w:p>
+            <w:pPr>
+              <w:jc w:val="center"/>
+              <w:rPr>
+                <w:b/>
+                <w:bCs/>
+                <w:color w:val="2E7D32"/>
+                <w:sz w:val="19"/>
+                <w:szCs w:val="19"/>
+              </w:rPr>
+            </w:pPr>
+          </w:p>
+        </w:tc>
+        <w:tc>
+          <w:tcPr>
+            <w:tcW w:w="4800" w:type="dxa"/>
+            <w:tcMar>
+              <w:top w:w="100" w:type="dxa"/>
+              <w:left w:w="120" w:type="dxa"/>
+              <w:bottom w:w="100" w:type="dxa"/>
+              <w:right w:w="120" w:type="dxa"/>
+            </w:tcMar>
+          </w:tcPr>
+          <w:p>
+            <w:pPr>
+              <w:rPr>
+                <w:color w:val="000000"/>
+                <w:sz w:val="19"/>
+                <w:szCs w:val="19"/>
+              </w:rPr>
+            </w:pPr>
+            <w:r>
+              <w:rPr>
+                <w:color w:val="000000"/>
+                <w:sz w:val="19"/>
+                <w:szCs w:val="19"/>
+              </w:rPr>
+              <w:t>GitHub Actions opérationnel (</w:t>
+            </w:r>
+            <w:proofErr w:type="spellStart"/>
+            <w:r>
+              <w:rPr>
+                <w:color w:val="000000"/>
+                <w:sz w:val="19"/>
+                <w:szCs w:val="19"/>
+              </w:rPr>
+              <w:t>build</w:t>
+            </w:r>
+            <w:proofErr w:type="spellEnd"/>
+            <w:r>
+              <w:rPr>
+                <w:color w:val="000000"/>
+                <w:sz w:val="19"/>
+                <w:szCs w:val="19"/>
+              </w:rPr>
+              <w:t>, test, nettoyage automatiques).</w:t>
+            </w:r>
+          </w:p>
+          <w:p>
+            <w:pPr>
+              <w:rPr>
+                <w:color w:val="000000"/>
+                <w:sz w:val="19"/>
+                <w:szCs w:val="19"/>
+              </w:rPr>
+            </w:pPr>
+          </w:p>
+        </w:tc>
+      </w:tr>
+      <w:tr>
+        <w:trPr>
+          <w:trHeight w:val="297"/>
+        </w:trPr>
+        <w:tc>
+          <w:tcPr>
+            <w:tcW w:w="3000" w:type="dxa"/>
+            <w:tcMar>
+              <w:top w:w="100" w:type="dxa"/>
+              <w:left w:w="120" w:type="dxa"/>
+              <w:bottom w:w="100" w:type="dxa"/>
+              <w:right w:w="120" w:type="dxa"/>
+            </w:tcMar>
+          </w:tcPr>
+          <w:p>
+            <w:r>
+              <w:rPr>
+                <w:color w:val="000000"/>
+                <w:sz w:val="19"/>
+                <w:szCs w:val="19"/>
+              </w:rPr>
+              <w:t>Sécurité des accès (clés/secrets</w:t>
+            </w:r>
+            <w:r>
+              <w:rPr>
+                <w:color w:val="000000"/>
+                <w:sz w:val="19"/>
+                <w:szCs w:val="19"/>
+              </w:rPr>
+              <w:t>)</w:t>
+            </w:r>
+          </w:p>
+        </w:tc>
+        <w:tc>
+          <w:tcPr>
+            <w:tcW w:w="2000" w:type="dxa"/>
+            <w:shd w:val="clear" w:color="auto" w:fill="E2EFDA"/>
+            <w:tcMar>
+              <w:top w:w="100" w:type="dxa"/>
+              <w:left w:w="120" w:type="dxa"/>
+              <w:bottom w:w="100" w:type="dxa"/>
+              <w:right w:w="120" w:type="dxa"/>
+            </w:tcMar>
+          </w:tcPr>
+          <w:p>
+            <w:pPr>
+              <w:rPr>
+                <w:b/>
+                <w:bCs/>
+                <w:color w:val="2E7D32"/>
+              </w:rPr>
+            </w:pPr>
+          </w:p>
           <w:p>
             <w:pPr>
               <w:jc w:val="center"/>
@@ -6191,108 +6678,20 @@
             </w:tcMar>
           </w:tcPr>
           <w:p>
-            <w:r>
-              <w:rPr>
-                <w:color w:val="000000"/>
-                <w:sz w:val="19"/>
-                <w:szCs w:val="19"/>
-              </w:rPr>
-              <w:t>GitHub Actions opérationnel (</w:t>
-            </w:r>
-            <w:proofErr w:type="spellStart"/>
-            <w:r>
-              <w:rPr>
-                <w:color w:val="000000"/>
-                <w:sz w:val="19"/>
-                <w:szCs w:val="19"/>
-              </w:rPr>
-              <w:t>build</w:t>
-            </w:r>
-            <w:proofErr w:type="spellEnd"/>
-            <w:r>
-              <w:rPr>
-                <w:color w:val="000000"/>
-                <w:sz w:val="19"/>
-                <w:szCs w:val="19"/>
-              </w:rPr>
-              <w:t>, test, nettoyage automatiques).</w:t>
-            </w:r>
-          </w:p>
-        </w:tc>
-      </w:tr>
-      <w:tr>
-        <w:tblPrEx>
-          <w:tblCellMar>
-            <w:top w:w="0" w:type="dxa"/>
-            <w:bottom w:w="0" w:type="dxa"/>
-          </w:tblCellMar>
-        </w:tblPrEx>
-        <w:tc>
-          <w:tcPr>
-            <w:tcW w:w="3000" w:type="dxa"/>
-            <w:tcMar>
-              <w:top w:w="100" w:type="dxa"/>
-              <w:left w:w="120" w:type="dxa"/>
-              <w:bottom w:w="100" w:type="dxa"/>
-              <w:right w:w="120" w:type="dxa"/>
-            </w:tcMar>
-          </w:tcPr>
-          <w:p>
-            <w:r>
-              <w:rPr>
-                <w:color w:val="000000"/>
-                <w:sz w:val="19"/>
-                <w:szCs w:val="19"/>
-              </w:rPr>
-              <w:t>Sécurité des accès (clés/secrets)</w:t>
-            </w:r>
-          </w:p>
-        </w:tc>
-        <w:tc>
-          <w:tcPr>
-            <w:tcW w:w="2000" w:type="dxa"/>
-            <w:shd w:val="clear" w:color="auto" w:fill="FCE4E4"/>
-            <w:tcMar>
-              <w:top w:w="100" w:type="dxa"/>
-              <w:left w:w="120" w:type="dxa"/>
-              <w:bottom w:w="100" w:type="dxa"/>
-              <w:right w:w="120" w:type="dxa"/>
-            </w:tcMar>
-          </w:tcPr>
-          <w:p>
             <w:pPr>
-              <w:jc w:val="center"/>
+              <w:rPr>
+                <w:color w:val="000000"/>
+                <w:sz w:val="19"/>
+                <w:szCs w:val="19"/>
+              </w:rPr>
             </w:pPr>
             <w:r>
               <w:rPr>
-                <w:b/>
-                <w:bCs/>
-                <w:color w:val="C00000"/>
-                <w:sz w:val="19"/>
-                <w:szCs w:val="19"/>
-              </w:rPr>
-              <w:t>NO-GO</w:t>
-            </w:r>
-          </w:p>
-        </w:tc>
-        <w:tc>
-          <w:tcPr>
-            <w:tcW w:w="4800" w:type="dxa"/>
-            <w:tcMar>
-              <w:top w:w="100" w:type="dxa"/>
-              <w:left w:w="120" w:type="dxa"/>
-              <w:bottom w:w="100" w:type="dxa"/>
-              <w:right w:w="120" w:type="dxa"/>
-            </w:tcMar>
-          </w:tcPr>
-          <w:p>
-            <w:r>
-              <w:rPr>
-                <w:color w:val="000000"/>
-                <w:sz w:val="19"/>
-                <w:szCs w:val="19"/>
-              </w:rPr>
-              <w:t>Aucune authentification sur l'API à ce stade.</w:t>
+                <w:rFonts w:ascii="AppleSystemUIFont" w:hAnsi="AppleSystemUIFont" w:cs="AppleSystemUIFont"/>
+                <w:sz w:val="19"/>
+                <w:szCs w:val="19"/>
+              </w:rPr>
+              <w:t>Authentification X-API-Key</w:t>
             </w:r>
           </w:p>
         </w:tc>
@@ -6339,12 +6738,6 @@
         <w:gridCol w:w="4800"/>
       </w:tblGrid>
       <w:tr>
-        <w:tblPrEx>
-          <w:tblCellMar>
-            <w:top w:w="0" w:type="dxa"/>
-            <w:bottom w:w="0" w:type="dxa"/>
-          </w:tblCellMar>
-        </w:tblPrEx>
         <w:trPr>
           <w:tblHeader/>
         </w:trPr>
@@ -6425,12 +6818,6 @@
         </w:tc>
       </w:tr>
       <w:tr>
-        <w:tblPrEx>
-          <w:tblCellMar>
-            <w:top w:w="0" w:type="dxa"/>
-            <w:bottom w:w="0" w:type="dxa"/>
-          </w:tblCellMar>
-        </w:tblPrEx>
         <w:tc>
           <w:tcPr>
             <w:tcW w:w="3000" w:type="dxa"/>
@@ -6520,12 +6907,6 @@
         </w:tc>
       </w:tr>
       <w:tr>
-        <w:tblPrEx>
-          <w:tblCellMar>
-            <w:top w:w="0" w:type="dxa"/>
-            <w:bottom w:w="0" w:type="dxa"/>
-          </w:tblCellMar>
-        </w:tblPrEx>
         <w:tc>
           <w:tcPr>
             <w:tcW w:w="3000" w:type="dxa"/>
@@ -6597,12 +6978,6 @@
         </w:tc>
       </w:tr>
       <w:tr>
-        <w:tblPrEx>
-          <w:tblCellMar>
-            <w:top w:w="0" w:type="dxa"/>
-            <w:bottom w:w="0" w:type="dxa"/>
-          </w:tblCellMar>
-        </w:tblPrEx>
         <w:tc>
           <w:tcPr>
             <w:tcW w:w="3000" w:type="dxa"/>
@@ -6620,7 +6995,6 @@
                 <w:sz w:val="19"/>
                 <w:szCs w:val="19"/>
               </w:rPr>
-              <w:lastRenderedPageBreak/>
               <w:t>Absence d'hallucinations dangereuses</w:t>
             </w:r>
           </w:p>
@@ -6708,14 +7082,7 @@
           <w:sz w:val="21"/>
           <w:szCs w:val="21"/>
         </w:rPr>
-        <w:t>U</w:t>
-      </w:r>
-      <w:r>
-        <w:rPr>
-          <w:sz w:val="21"/>
-          <w:szCs w:val="21"/>
-        </w:rPr>
-        <w:t>n POC a pour objet de démontrer une faisabilité technique, non de livrer un produit fini prêt pour la production clinique.</w:t>
+        <w:t>Un POC a pour objet de démontrer une faisabilité technique, non de livrer un produit fini prêt pour la production clinique.</w:t>
       </w:r>
     </w:p>
     <w:p>
@@ -6776,7 +7143,8 @@
           <w:sz w:val="21"/>
           <w:szCs w:val="21"/>
         </w:rPr>
-        <w:t>Ajout d'une authentification et d'une gestion des secrets sur l'API avant toute exposition, même pilote ;</w:t>
+        <w:lastRenderedPageBreak/>
+        <w:t>Validation clinique formelle du signal de priorité par un comité médical, avant tout usage impliquant des patients réels ;</w:t>
       </w:r>
     </w:p>
     <w:p>
@@ -6793,7 +7161,7 @@
           <w:sz w:val="21"/>
           <w:szCs w:val="21"/>
         </w:rPr>
-        <w:t>Validation clinique formelle du signal de priorité par un comité médical, avant tout usage impliquant des patients réels ;</w:t>
+        <w:t>Mise en place d'un mécanisme de garde-fou (seuil de confiance, réponse « indéterminé » plutôt qu'un signal potentiellement erroné) pour les cas ambigus ;</w:t>
       </w:r>
     </w:p>
     <w:p>
@@ -6810,40 +7178,6 @@
           <w:sz w:val="21"/>
           <w:szCs w:val="21"/>
         </w:rPr>
-        <w:t>Mise en place d'un mécanisme de garde-fou (seuil de confiance, réponse « indéterminé » plutôt qu'un signal potentiellement erroné) pour les cas ambigus ;</w:t>
-      </w:r>
-    </w:p>
-    <w:p>
-      <w:pPr>
-        <w:pStyle w:val="Paragraphedeliste"/>
-        <w:numPr>
-          <w:ilvl w:val="0"/>
-          <w:numId w:val="4"/>
-        </w:numPr>
-        <w:spacing w:after="100" w:line="280" w:lineRule="auto"/>
-      </w:pPr>
-      <w:r>
-        <w:rPr>
-          <w:sz w:val="21"/>
-          <w:szCs w:val="21"/>
-        </w:rPr>
-        <w:t>Gestion de la troncature des contextes longs, avec dégradation gracieuse plutôt qu'échec sec ;</w:t>
-      </w:r>
-    </w:p>
-    <w:p>
-      <w:pPr>
-        <w:pStyle w:val="Paragraphedeliste"/>
-        <w:numPr>
-          <w:ilvl w:val="0"/>
-          <w:numId w:val="4"/>
-        </w:numPr>
-        <w:spacing w:after="100" w:line="280" w:lineRule="auto"/>
-      </w:pPr>
-      <w:r>
-        <w:rPr>
-          <w:sz w:val="21"/>
-          <w:szCs w:val="21"/>
-        </w:rPr>
         <w:t>Renforcement de l'anonymisation par une relecture humaine ciblée sur les faux positifs résiduels.</w:t>
       </w:r>
     </w:p>
@@ -6920,7 +7254,7 @@
           <w:sz w:val="21"/>
           <w:szCs w:val="21"/>
         </w:rPr>
-        <w:t>Une infrastructure de production robuste (authentification, monitoring, plan de bascule, procédures de surveillance post-déploiement).</w:t>
+        <w:t>Une infrastructure de production robuste (monitoring, plan de bascule, procédures de surveillance post-déploiement).</w:t>
       </w:r>
     </w:p>
     <w:p>
@@ -7257,6 +7591,155 @@
     </w:lvl>
   </w:abstractNum>
   <w:abstractNum w:abstractNumId="2" w15:restartNumberingAfterBreak="0">
+    <w:nsid w:val="2CD1047B"/>
+    <w:multiLevelType w:val="multilevel"/>
+    <w:tmpl w:val="4642C72A"/>
+    <w:lvl w:ilvl="0">
+      <w:start w:val="1"/>
+      <w:numFmt w:val="bullet"/>
+      <w:lvlText w:val=""/>
+      <w:lvlJc w:val="left"/>
+      <w:pPr>
+        <w:tabs>
+          <w:tab w:val="num" w:pos="720"/>
+        </w:tabs>
+        <w:ind w:left="720" w:hanging="360"/>
+      </w:pPr>
+      <w:rPr>
+        <w:rFonts w:ascii="Symbol" w:hAnsi="Symbol" w:hint="default"/>
+        <w:sz w:val="20"/>
+      </w:rPr>
+    </w:lvl>
+    <w:lvl w:ilvl="1" w:tentative="1">
+      <w:start w:val="1"/>
+      <w:numFmt w:val="bullet"/>
+      <w:lvlText w:val="o"/>
+      <w:lvlJc w:val="left"/>
+      <w:pPr>
+        <w:tabs>
+          <w:tab w:val="num" w:pos="1440"/>
+        </w:tabs>
+        <w:ind w:left="1440" w:hanging="360"/>
+      </w:pPr>
+      <w:rPr>
+        <w:rFonts w:ascii="Courier New" w:hAnsi="Courier New" w:hint="default"/>
+        <w:sz w:val="20"/>
+      </w:rPr>
+    </w:lvl>
+    <w:lvl w:ilvl="2" w:tentative="1">
+      <w:start w:val="1"/>
+      <w:numFmt w:val="bullet"/>
+      <w:lvlText w:val=""/>
+      <w:lvlJc w:val="left"/>
+      <w:pPr>
+        <w:tabs>
+          <w:tab w:val="num" w:pos="2160"/>
+        </w:tabs>
+        <w:ind w:left="2160" w:hanging="360"/>
+      </w:pPr>
+      <w:rPr>
+        <w:rFonts w:ascii="Wingdings" w:hAnsi="Wingdings" w:hint="default"/>
+        <w:sz w:val="20"/>
+      </w:rPr>
+    </w:lvl>
+    <w:lvl w:ilvl="3" w:tentative="1">
+      <w:start w:val="1"/>
+      <w:numFmt w:val="bullet"/>
+      <w:lvlText w:val=""/>
+      <w:lvlJc w:val="left"/>
+      <w:pPr>
+        <w:tabs>
+          <w:tab w:val="num" w:pos="2880"/>
+        </w:tabs>
+        <w:ind w:left="2880" w:hanging="360"/>
+      </w:pPr>
+      <w:rPr>
+        <w:rFonts w:ascii="Wingdings" w:hAnsi="Wingdings" w:hint="default"/>
+        <w:sz w:val="20"/>
+      </w:rPr>
+    </w:lvl>
+    <w:lvl w:ilvl="4" w:tentative="1">
+      <w:start w:val="1"/>
+      <w:numFmt w:val="bullet"/>
+      <w:lvlText w:val=""/>
+      <w:lvlJc w:val="left"/>
+      <w:pPr>
+        <w:tabs>
+          <w:tab w:val="num" w:pos="3600"/>
+        </w:tabs>
+        <w:ind w:left="3600" w:hanging="360"/>
+      </w:pPr>
+      <w:rPr>
+        <w:rFonts w:ascii="Wingdings" w:hAnsi="Wingdings" w:hint="default"/>
+        <w:sz w:val="20"/>
+      </w:rPr>
+    </w:lvl>
+    <w:lvl w:ilvl="5" w:tentative="1">
+      <w:start w:val="1"/>
+      <w:numFmt w:val="bullet"/>
+      <w:lvlText w:val=""/>
+      <w:lvlJc w:val="left"/>
+      <w:pPr>
+        <w:tabs>
+          <w:tab w:val="num" w:pos="4320"/>
+        </w:tabs>
+        <w:ind w:left="4320" w:hanging="360"/>
+      </w:pPr>
+      <w:rPr>
+        <w:rFonts w:ascii="Wingdings" w:hAnsi="Wingdings" w:hint="default"/>
+        <w:sz w:val="20"/>
+      </w:rPr>
+    </w:lvl>
+    <w:lvl w:ilvl="6" w:tentative="1">
+      <w:start w:val="1"/>
+      <w:numFmt w:val="bullet"/>
+      <w:lvlText w:val=""/>
+      <w:lvlJc w:val="left"/>
+      <w:pPr>
+        <w:tabs>
+          <w:tab w:val="num" w:pos="5040"/>
+        </w:tabs>
+        <w:ind w:left="5040" w:hanging="360"/>
+      </w:pPr>
+      <w:rPr>
+        <w:rFonts w:ascii="Wingdings" w:hAnsi="Wingdings" w:hint="default"/>
+        <w:sz w:val="20"/>
+      </w:rPr>
+    </w:lvl>
+    <w:lvl w:ilvl="7" w:tentative="1">
+      <w:start w:val="1"/>
+      <w:numFmt w:val="bullet"/>
+      <w:lvlText w:val=""/>
+      <w:lvlJc w:val="left"/>
+      <w:pPr>
+        <w:tabs>
+          <w:tab w:val="num" w:pos="5760"/>
+        </w:tabs>
+        <w:ind w:left="5760" w:hanging="360"/>
+      </w:pPr>
+      <w:rPr>
+        <w:rFonts w:ascii="Wingdings" w:hAnsi="Wingdings" w:hint="default"/>
+        <w:sz w:val="20"/>
+      </w:rPr>
+    </w:lvl>
+    <w:lvl w:ilvl="8" w:tentative="1">
+      <w:start w:val="1"/>
+      <w:numFmt w:val="bullet"/>
+      <w:lvlText w:val=""/>
+      <w:lvlJc w:val="left"/>
+      <w:pPr>
+        <w:tabs>
+          <w:tab w:val="num" w:pos="6480"/>
+        </w:tabs>
+        <w:ind w:left="6480" w:hanging="360"/>
+      </w:pPr>
+      <w:rPr>
+        <w:rFonts w:ascii="Wingdings" w:hAnsi="Wingdings" w:hint="default"/>
+        <w:sz w:val="20"/>
+      </w:rPr>
+    </w:lvl>
+  </w:abstractNum>
+  <w:abstractNum w:abstractNumId="3" w15:restartNumberingAfterBreak="0">
     <w:nsid w:val="360E773C"/>
     <w:multiLevelType w:val="hybridMultilevel"/>
     <w:tmpl w:val="F2DA3648"/>
@@ -7342,7 +7825,7 @@
       </w:pPr>
     </w:lvl>
   </w:abstractNum>
-  <w:abstractNum w:abstractNumId="3" w15:restartNumberingAfterBreak="0">
+  <w:abstractNum w:abstractNumId="4" w15:restartNumberingAfterBreak="0">
     <w:nsid w:val="4A92184B"/>
     <w:multiLevelType w:val="hybridMultilevel"/>
     <w:tmpl w:val="33548C16"/>
@@ -7397,7 +7880,7 @@
     </w:lvl>
   </w:abstractNum>
   <w:num w:numId="1" w16cid:durableId="149057781">
-    <w:abstractNumId w:val="2"/>
+    <w:abstractNumId w:val="3"/>
     <w:lvlOverride w:ilvl="0">
       <w:startOverride w:val="1"/>
     </w:lvlOverride>
@@ -7409,7 +7892,7 @@
     </w:lvlOverride>
   </w:num>
   <w:num w:numId="3" w16cid:durableId="1871720088">
-    <w:abstractNumId w:val="3"/>
+    <w:abstractNumId w:val="4"/>
     <w:lvlOverride w:ilvl="0">
       <w:startOverride w:val="1"/>
     </w:lvlOverride>
@@ -7419,6 +7902,9 @@
     <w:lvlOverride w:ilvl="0">
       <w:startOverride w:val="1"/>
     </w:lvlOverride>
+  </w:num>
+  <w:num w:numId="5" w16cid:durableId="204222532">
+    <w:abstractNumId w:val="2"/>
   </w:num>
 </w:numbering>
 </file>
@@ -8009,6 +8495,45 @@
       <w:szCs w:val="20"/>
     </w:rPr>
   </w:style>
+  <w:style w:type="character" w:styleId="lev">
+    <w:name w:val="Strong"/>
+    <w:basedOn w:val="Policepardfaut"/>
+    <w:uiPriority w:val="22"/>
+    <w:qFormat/>
+    <w:rsid w:val="00F32A56"/>
+    <w:rPr>
+      <w:b/>
+      <w:bCs/>
+    </w:rPr>
+  </w:style>
+  <w:style w:type="paragraph" w:styleId="NormalWeb">
+    <w:name w:val="Normal (Web)"/>
+    <w:basedOn w:val="Normal"/>
+    <w:uiPriority w:val="99"/>
+    <w:semiHidden/>
+    <w:unhideWhenUsed/>
+    <w:rsid w:val="00F32A56"/>
+    <w:pPr>
+      <w:spacing w:before="100" w:beforeAutospacing="1" w:after="100" w:afterAutospacing="1"/>
+    </w:pPr>
+    <w:rPr>
+      <w:sz w:val="24"/>
+      <w:szCs w:val="24"/>
+    </w:rPr>
+  </w:style>
+  <w:style w:type="character" w:styleId="CodeHTML">
+    <w:name w:val="HTML Code"/>
+    <w:basedOn w:val="Policepardfaut"/>
+    <w:uiPriority w:val="99"/>
+    <w:semiHidden/>
+    <w:unhideWhenUsed/>
+    <w:rsid w:val="00F32A56"/>
+    <w:rPr>
+      <w:rFonts w:ascii="Courier New" w:eastAsia="Times New Roman" w:hAnsi="Courier New" w:cs="Courier New"/>
+      <w:sz w:val="20"/>
+      <w:szCs w:val="20"/>
+    </w:rPr>
+  </w:style>
 </w:styles>
 </file>
 

</xml_diff>